<commit_message>
Add Options collection with three turndown configuration fields
Introduces an n8n Options collection on the DocxToMd node and wires
the first three fields — Heading Style, Bullet List Marker, and
Code Block Style — through to turndown. User options now override the
hardcoded defaults instead of being overridden by them.

Co-Authored-By: Claude Opus 4.7 (1M context) <noreply@anthropic.com>
</commit_message>
<xml_diff>
--- a/tests/fixtures/simple.docx
+++ b/tests/fixtures/simple.docx
@@ -48,4 +48,23 @@
     </w:p>
   </w:body>
 </w:document>
+</file>
+
+<file path=word/numbering.xml><?xml version="1.0" encoding="utf-8"?>
+<w:numbering xmlns:w="http://schemas.openxmlformats.org/wordprocessingml/2006/main">
+  <w:abstractNum w:abstractNumId="1">
+    <w:lvl w:ilvl="0">
+      <w:start w:val="1"/>
+      <w:numFmt w:val="bullet"/>
+      <w:lvlText w:val="•"/>
+      <w:lvlJc w:val="left"/>
+      <w:pPr>
+        <w:ind w:left="720" w:hanging="360"/>
+      </w:pPr>
+    </w:lvl>
+  </w:abstractNum>
+  <w:num w:numId="1">
+    <w:abstractNumId w:val="1"/>
+  </w:num>
+</w:numbering>
 </file>
</xml_diff>

<commit_message>
Address code review: real codeBlockStyle assertion and minor nits
Co-Authored-By: Claude Opus 4.7 (1M context) <noreply@anthropic.com>
</commit_message>
<xml_diff>
--- a/tests/fixtures/simple.docx
+++ b/tests/fixtures/simple.docx
@@ -46,6 +46,14 @@
         <w:t>Second item</w:t>
       </w:r>
     </w:p>
+    <w:p>
+      <w:pPr>
+        <w:pStyle w:val="Code"/>
+      </w:pPr>
+      <w:r>
+        <w:t>const x = 1;</w:t>
+      </w:r>
+    </w:p>
   </w:body>
 </w:document>
 </file>
@@ -67,4 +75,12 @@
     <w:abstractNumId w:val="1"/>
   </w:num>
 </w:numbering>
+</file>
+
+<file path=word/styles.xml><?xml version="1.0" encoding="utf-8"?>
+<w:styles xmlns:w="http://schemas.openxmlformats.org/wordprocessingml/2006/main">
+  <w:style w:type="paragraph" w:styleId="Code">
+    <w:name w:val="Code"/>
+  </w:style>
+</w:styles>
 </file>
</xml_diff>

<commit_message>
Address code review: tighten lint=false assertion and clean description
Co-Authored-By: Claude Opus 4.7 (1M context) <noreply@anthropic.com>
</commit_message>
<xml_diff>
--- a/tests/fixtures/simple.docx
+++ b/tests/fixtures/simple.docx
@@ -47,6 +47,16 @@
       </w:r>
     </w:p>
     <w:p>
+      <w:r>
+        <w:br/>
+      </w:r>
+    </w:p>
+    <w:p>
+      <w:r>
+        <w:br/>
+      </w:r>
+    </w:p>
+    <w:p>
       <w:pPr>
         <w:pStyle w:val="Code"/>
       </w:pPr>

</xml_diff>